<commit_message>
feat: stabilize reporting workflows and PMK cost datasets
</commit_message>
<xml_diff>
--- a/resources/documents/Template_Laporan_Perjadin.docx
+++ b/resources/documents/Template_Laporan_Perjadin.docx
@@ -1,6 +1,6 @@
 
 <file path=word/document.xml><?xml version="1.0" encoding="utf-8"?>
-<w:document xmlns:wpc="http://schemas.microsoft.com/office/word/2010/wordprocessingCanvas" xmlns:cx="http://schemas.microsoft.com/office/drawing/2014/chartex" xmlns:cx1="http://schemas.microsoft.com/office/drawing/2015/9/8/chartex" xmlns:cx2="http://schemas.microsoft.com/office/drawing/2015/10/21/chartex" xmlns:cx3="http://schemas.microsoft.com/office/drawing/2016/5/9/chartex" xmlns:cx4="http://schemas.microsoft.com/office/drawing/2016/5/10/chartex" xmlns:cx5="http://schemas.microsoft.com/office/drawing/2016/5/11/chartex" xmlns:cx6="http://schemas.microsoft.com/office/drawing/2016/5/12/chartex" xmlns:cx7="http://schemas.microsoft.com/office/drawing/2016/5/13/chartex" xmlns:cx8="http://schemas.microsoft.com/office/drawing/2016/5/14/chartex" xmlns:mc="http://schemas.openxmlformats.org/markup-compatibility/2006" xmlns:aink="http://schemas.microsoft.com/office/drawing/2016/ink" xmlns:am3d="http://schemas.microsoft.com/office/drawing/2017/model3d" xmlns:o="urn:schemas-microsoft-com:office:office" xmlns:oel="http://schemas.microsoft.com/office/2019/extlst" xmlns:r="http://schemas.openxmlformats.org/officeDocument/2006/relationships" xmlns:m="http://schemas.openxmlformats.org/officeDocument/2006/math" xmlns:v="urn:schemas-microsoft-com:vml" xmlns:wp14="http://schemas.microsoft.com/office/word/2010/wordprocessingDrawing" xmlns:wp="http://schemas.openxmlformats.org/drawingml/2006/wordprocessingDrawing" xmlns:w10="urn:schemas-microsoft-com:office:word" xmlns:w="http://schemas.openxmlformats.org/wordprocessingml/2006/main" xmlns:w14="http://schemas.microsoft.com/office/word/2010/wordml" xmlns:w15="http://schemas.microsoft.com/office/word/2012/wordml" xmlns:w16cei="http://schemas.microsoft.com/office/word/2026/wordml/cei" xmlns:w16cex="http://schemas.microsoft.com/office/word/2018/wordml/cex" xmlns:w16cid="http://schemas.microsoft.com/office/word/2016/wordml/cid" xmlns:w16="http://schemas.microsoft.com/office/word/2018/wordml" xmlns:w16du="http://schemas.microsoft.com/office/word/2023/wordml/word16du" xmlns:w16sdtdh="http://schemas.microsoft.com/office/word/2020/wordml/sdtdatahash" xmlns:w16sdtfl="http://schemas.microsoft.com/office/word/2024/wordml/sdtformatlock" xmlns:w16se="http://schemas.microsoft.com/office/word/2015/wordml/symex" xmlns:wpg="http://schemas.microsoft.com/office/word/2010/wordprocessingGroup" xmlns:wpi="http://schemas.microsoft.com/office/word/2010/wordprocessingInk" xmlns:wne="http://schemas.microsoft.com/office/word/2006/wordml" xmlns:wps="http://schemas.microsoft.com/office/word/2010/wordprocessingShape" mc:Ignorable="w14 w15 w16se w16cid w16 w16cex w16sdtdh w16sdtfl w16du wp14">
+<w:document xmlns:wpc="http://schemas.microsoft.com/office/word/2010/wordprocessingCanvas" xmlns:cx="http://schemas.microsoft.com/office/drawing/2014/chartex" xmlns:cx1="http://schemas.microsoft.com/office/drawing/2015/9/8/chartex" xmlns:cx2="http://schemas.microsoft.com/office/drawing/2015/10/21/chartex" xmlns:cx3="http://schemas.microsoft.com/office/drawing/2016/5/9/chartex" xmlns:cx4="http://schemas.microsoft.com/office/drawing/2016/5/10/chartex" xmlns:cx5="http://schemas.microsoft.com/office/drawing/2016/5/11/chartex" xmlns:cx6="http://schemas.microsoft.com/office/drawing/2016/5/12/chartex" xmlns:cx7="http://schemas.microsoft.com/office/drawing/2016/5/13/chartex" xmlns:cx8="http://schemas.microsoft.com/office/drawing/2016/5/14/chartex" xmlns:mc="http://schemas.openxmlformats.org/markup-compatibility/2006" xmlns:aink="http://schemas.microsoft.com/office/drawing/2016/ink" xmlns:am3d="http://schemas.microsoft.com/office/drawing/2017/model3d" xmlns:o="urn:schemas-microsoft-com:office:office" xmlns:oel="http://schemas.microsoft.com/office/2019/extlst" xmlns:r="http://schemas.openxmlformats.org/officeDocument/2006/relationships" xmlns:m="http://schemas.openxmlformats.org/officeDocument/2006/math" xmlns:v="urn:schemas-microsoft-com:vml" xmlns:wp14="http://schemas.microsoft.com/office/word/2010/wordprocessingDrawing" xmlns:wp="http://schemas.openxmlformats.org/drawingml/2006/wordprocessingDrawing" xmlns:w10="urn:schemas-microsoft-com:office:word" xmlns:w="http://schemas.openxmlformats.org/wordprocessingml/2006/main" xmlns:w14="http://schemas.microsoft.com/office/word/2010/wordml" xmlns:w15="http://schemas.microsoft.com/office/word/2012/wordml" xmlns:w16cex="http://schemas.microsoft.com/office/word/2018/wordml/cex" xmlns:w16cid="http://schemas.microsoft.com/office/word/2016/wordml/cid" xmlns:w16="http://schemas.microsoft.com/office/word/2018/wordml" xmlns:w16du="http://schemas.microsoft.com/office/word/2023/wordml/word16du" xmlns:w16sdtdh="http://schemas.microsoft.com/office/word/2020/wordml/sdtdatahash" xmlns:w16sdtfl="http://schemas.microsoft.com/office/word/2024/wordml/sdtformatlock" xmlns:w16se="http://schemas.microsoft.com/office/word/2015/wordml/symex" xmlns:wpg="http://schemas.microsoft.com/office/word/2010/wordprocessingGroup" xmlns:wpi="http://schemas.microsoft.com/office/word/2010/wordprocessingInk" xmlns:wne="http://schemas.microsoft.com/office/word/2006/wordml" xmlns:wps="http://schemas.microsoft.com/office/word/2010/wordprocessingShape" mc:Ignorable="w14 w15 w16se w16cid w16 w16cex w16sdtdh w16sdtfl w16du wp14">
   <w:body>
     <w:p/>
     <w:p/>
@@ -249,7 +249,7 @@
         <w:jc w:val="both"/>
       </w:pPr>
       <w:r>
-        <w:t>Hasil Pelaksanaan</w:t>
+        <w:t>Kegiatan dan Hasil yang Dicapai</w:t>
       </w:r>
     </w:p>
     <w:p>
@@ -273,7 +273,7 @@
         <w:jc w:val="both"/>
       </w:pPr>
       <w:r>
-        <w:t>Kesimpulan</w:t>
+        <w:t>Simpulan dan Saran</w:t>
       </w:r>
     </w:p>
     <w:p>
@@ -294,20 +294,12 @@
     </w:p>
     <w:p>
       <w:pPr>
-        <w:spacing w:line="360" w:lineRule="auto"/>
+        <w:keepNext/>
+        <w:spacing w:after="360" w:line="360" w:lineRule="auto"/>
         <w:jc w:val="both"/>
       </w:pPr>
       <w:r>
         <w:t>Demikian laporan kegiatan ini dibuat sebagai pertanggungjawaban pelaksanaan kegiatan.</w:t>
-      </w:r>
-    </w:p>
-    <w:p>
-      <w:pPr>
-        <w:spacing w:line="360" w:lineRule="auto"/>
-        <w:jc w:val="both"/>
-      </w:pPr>
-      <w:r>
-        <w:br/>
       </w:r>
     </w:p>
     <w:tbl>
@@ -332,125 +324,8 @@
         <w:gridCol w:w="3120"/>
       </w:tblGrid>
       <w:tr>
-        <w:tc>
-          <w:tcPr>
-            <w:tcW w:w="3120" w:type="dxa"/>
-            <w:tcBorders>
-              <w:top w:val="single" w:sz="8" w:space="0" w:color="FFFFFF"/>
-              <w:left w:val="single" w:sz="8" w:space="0" w:color="FFFFFF"/>
-              <w:bottom w:val="single" w:sz="8" w:space="0" w:color="FFFFFF"/>
-              <w:right w:val="single" w:sz="8" w:space="0" w:color="FFFFFF"/>
-            </w:tcBorders>
-            <w:tcMar>
-              <w:top w:w="100" w:type="dxa"/>
-              <w:left w:w="100" w:type="dxa"/>
-              <w:bottom w:w="100" w:type="dxa"/>
-              <w:right w:w="100" w:type="dxa"/>
-            </w:tcMar>
-            <w:vAlign w:val="center"/>
-          </w:tcPr>
-          <w:p>
-            <w:pPr>
-              <w:widowControl w:val="0"/>
-              <w:pBdr>
-                <w:top w:val="nil"/>
-                <w:left w:val="nil"/>
-                <w:bottom w:val="nil"/>
-                <w:right w:val="nil"/>
-                <w:between w:val="nil"/>
-              </w:pBdr>
-              <w:spacing w:line="240" w:lineRule="auto"/>
-            </w:pPr>
-          </w:p>
-        </w:tc>
-        <w:tc>
-          <w:tcPr>
-            <w:tcW w:w="3120" w:type="dxa"/>
-            <w:tcBorders>
-              <w:top w:val="single" w:sz="8" w:space="0" w:color="FFFFFF"/>
-              <w:left w:val="single" w:sz="8" w:space="0" w:color="FFFFFF"/>
-              <w:bottom w:val="single" w:sz="8" w:space="0" w:color="FFFFFF"/>
-              <w:right w:val="single" w:sz="8" w:space="0" w:color="FFFFFF"/>
-            </w:tcBorders>
-            <w:tcMar>
-              <w:top w:w="100" w:type="dxa"/>
-              <w:left w:w="100" w:type="dxa"/>
-              <w:bottom w:w="100" w:type="dxa"/>
-              <w:right w:w="100" w:type="dxa"/>
-            </w:tcMar>
-            <w:vAlign w:val="center"/>
-          </w:tcPr>
-          <w:p>
-            <w:pPr>
-              <w:widowControl w:val="0"/>
-              <w:pBdr>
-                <w:top w:val="nil"/>
-                <w:left w:val="nil"/>
-                <w:bottom w:val="nil"/>
-                <w:right w:val="nil"/>
-                <w:between w:val="nil"/>
-              </w:pBdr>
-              <w:spacing w:line="240" w:lineRule="auto"/>
-            </w:pPr>
-          </w:p>
-        </w:tc>
-        <w:tc>
-          <w:tcPr>
-            <w:tcW w:w="3120" w:type="dxa"/>
-            <w:tcBorders>
-              <w:top w:val="single" w:sz="8" w:space="0" w:color="FFFFFF"/>
-              <w:left w:val="single" w:sz="8" w:space="0" w:color="FFFFFF"/>
-              <w:bottom w:val="single" w:sz="8" w:space="0" w:color="FFFFFF"/>
-              <w:right w:val="single" w:sz="8" w:space="0" w:color="FFFFFF"/>
-            </w:tcBorders>
-            <w:tcMar>
-              <w:top w:w="100" w:type="dxa"/>
-              <w:left w:w="100" w:type="dxa"/>
-              <w:bottom w:w="100" w:type="dxa"/>
-              <w:right w:w="100" w:type="dxa"/>
-            </w:tcMar>
-            <w:vAlign w:val="center"/>
-          </w:tcPr>
-          <w:p>
-            <w:pPr>
-              <w:widowControl w:val="0"/>
-              <w:pBdr>
-                <w:top w:val="nil"/>
-                <w:left w:val="nil"/>
-                <w:bottom w:val="nil"/>
-                <w:right w:val="nil"/>
-                <w:between w:val="nil"/>
-              </w:pBdr>
-              <w:spacing w:line="240" w:lineRule="auto"/>
-            </w:pPr>
-            <w:r>
-              <w:t xml:space="preserve">Pangkep, </w:t>
-            </w:r>
-            <w:r>
-              <w:t>${tanggal_laporan}</w:t>
-            </w:r>
-          </w:p>
-          <w:p>
-            <w:pPr>
-              <w:widowControl w:val="0"/>
-              <w:pBdr>
-                <w:top w:val="nil"/>
-                <w:left w:val="nil"/>
-                <w:bottom w:val="nil"/>
-                <w:right w:val="nil"/>
-                <w:between w:val="nil"/>
-              </w:pBdr>
-              <w:spacing w:line="240" w:lineRule="auto"/>
-            </w:pPr>
-            <w:r>
-              <w:t>Pegawai yang bertugas,</w:t>
-            </w:r>
-          </w:p>
-        </w:tc>
-      </w:tr>
-      <w:tr>
         <w:trPr>
-          <w:trHeight w:val="1695"/>
+          <w:cantSplit/>
         </w:trPr>
         <w:tc>
           <w:tcPr>
@@ -533,6 +408,8 @@
           </w:tcPr>
           <w:p>
             <w:pPr>
+              <w:keepNext/>
+              <w:keepLines/>
               <w:widowControl w:val="0"/>
               <w:pBdr>
                 <w:top w:val="nil"/>
@@ -541,7 +418,46 @@
                 <w:right w:val="nil"/>
                 <w:between w:val="nil"/>
               </w:pBdr>
-              <w:spacing w:line="240" w:lineRule="auto"/>
+              <w:spacing w:line="360" w:lineRule="auto"/>
+            </w:pPr>
+            <w:r>
+              <w:t xml:space="preserve">Pangkep, </w:t>
+            </w:r>
+            <w:r>
+              <w:t>${tanggal_laporan}</w:t>
+            </w:r>
+          </w:p>
+          <w:p>
+            <w:pPr>
+              <w:keepNext/>
+              <w:keepLines/>
+              <w:widowControl w:val="0"/>
+              <w:pBdr>
+                <w:top w:val="nil"/>
+                <w:left w:val="nil"/>
+                <w:bottom w:val="nil"/>
+                <w:right w:val="nil"/>
+                <w:between w:val="nil"/>
+              </w:pBdr>
+              <w:spacing w:line="360" w:lineRule="auto"/>
+            </w:pPr>
+            <w:r>
+              <w:t>Pegawai yang bertugas,</w:t>
+            </w:r>
+          </w:p>
+          <w:p>
+            <w:pPr>
+              <w:keepNext/>
+              <w:keepLines/>
+              <w:widowControl w:val="0"/>
+              <w:pBdr>
+                <w:top w:val="nil"/>
+                <w:left w:val="nil"/>
+                <w:bottom w:val="nil"/>
+                <w:right w:val="nil"/>
+                <w:between w:val="nil"/>
+              </w:pBdr>
+              <w:spacing w:before="120" w:after="120" w:line="240" w:lineRule="auto"/>
             </w:pPr>
             <w:r>
               <w:t>${</w:t>
@@ -553,28 +469,10 @@
               <w:t>}</w:t>
             </w:r>
           </w:p>
-        </w:tc>
-      </w:tr>
-      <w:tr>
-        <w:tc>
-          <w:tcPr>
-            <w:tcW w:w="3120" w:type="dxa"/>
-            <w:tcBorders>
-              <w:top w:val="single" w:sz="8" w:space="0" w:color="FFFFFF"/>
-              <w:left w:val="single" w:sz="8" w:space="0" w:color="FFFFFF"/>
-              <w:bottom w:val="single" w:sz="8" w:space="0" w:color="FFFFFF"/>
-              <w:right w:val="single" w:sz="8" w:space="0" w:color="FFFFFF"/>
-            </w:tcBorders>
-            <w:tcMar>
-              <w:top w:w="100" w:type="dxa"/>
-              <w:left w:w="100" w:type="dxa"/>
-              <w:bottom w:w="100" w:type="dxa"/>
-              <w:right w:w="100" w:type="dxa"/>
-            </w:tcMar>
-            <w:vAlign w:val="center"/>
-          </w:tcPr>
           <w:p>
             <w:pPr>
+              <w:keepNext/>
+              <w:keepLines/>
               <w:widowControl w:val="0"/>
               <w:pBdr>
                 <w:top w:val="nil"/>
@@ -583,29 +481,15 @@
                 <w:right w:val="nil"/>
                 <w:between w:val="nil"/>
               </w:pBdr>
-              <w:spacing w:line="240" w:lineRule="auto"/>
+              <w:spacing w:line="360" w:lineRule="auto"/>
             </w:pPr>
+            <w:r>
+              <w:t>${nama_pegawai}</w:t>
+            </w:r>
           </w:p>
-        </w:tc>
-        <w:tc>
-          <w:tcPr>
-            <w:tcW w:w="3120" w:type="dxa"/>
-            <w:tcBorders>
-              <w:top w:val="single" w:sz="8" w:space="0" w:color="FFFFFF"/>
-              <w:left w:val="single" w:sz="8" w:space="0" w:color="FFFFFF"/>
-              <w:bottom w:val="single" w:sz="8" w:space="0" w:color="FFFFFF"/>
-              <w:right w:val="single" w:sz="8" w:space="0" w:color="FFFFFF"/>
-            </w:tcBorders>
-            <w:tcMar>
-              <w:top w:w="100" w:type="dxa"/>
-              <w:left w:w="100" w:type="dxa"/>
-              <w:bottom w:w="100" w:type="dxa"/>
-              <w:right w:w="100" w:type="dxa"/>
-            </w:tcMar>
-            <w:vAlign w:val="center"/>
-          </w:tcPr>
           <w:p>
             <w:pPr>
+              <w:keepLines/>
               <w:widowControl w:val="0"/>
               <w:pBdr>
                 <w:top w:val="nil"/>
@@ -614,54 +498,7 @@
                 <w:right w:val="nil"/>
                 <w:between w:val="nil"/>
               </w:pBdr>
-              <w:spacing w:line="240" w:lineRule="auto"/>
-            </w:pPr>
-          </w:p>
-        </w:tc>
-        <w:tc>
-          <w:tcPr>
-            <w:tcW w:w="3120" w:type="dxa"/>
-            <w:tcBorders>
-              <w:top w:val="single" w:sz="8" w:space="0" w:color="FFFFFF"/>
-              <w:left w:val="single" w:sz="8" w:space="0" w:color="FFFFFF"/>
-              <w:bottom w:val="single" w:sz="8" w:space="0" w:color="FFFFFF"/>
-              <w:right w:val="single" w:sz="8" w:space="0" w:color="FFFFFF"/>
-            </w:tcBorders>
-            <w:tcMar>
-              <w:top w:w="100" w:type="dxa"/>
-              <w:left w:w="100" w:type="dxa"/>
-              <w:bottom w:w="100" w:type="dxa"/>
-              <w:right w:w="100" w:type="dxa"/>
-            </w:tcMar>
-            <w:vAlign w:val="center"/>
-          </w:tcPr>
-          <w:p>
-            <w:pPr>
-              <w:widowControl w:val="0"/>
-              <w:pBdr>
-                <w:top w:val="nil"/>
-                <w:left w:val="nil"/>
-                <w:bottom w:val="nil"/>
-                <w:right w:val="nil"/>
-                <w:between w:val="nil"/>
-              </w:pBdr>
-              <w:spacing w:line="240" w:lineRule="auto"/>
-            </w:pPr>
-            <w:r>
-              <w:t>${nama_pegawai}</w:t>
-            </w:r>
-          </w:p>
-          <w:p>
-            <w:pPr>
-              <w:widowControl w:val="0"/>
-              <w:pBdr>
-                <w:top w:val="nil"/>
-                <w:left w:val="nil"/>
-                <w:bottom w:val="nil"/>
-                <w:right w:val="nil"/>
-                <w:between w:val="nil"/>
-              </w:pBdr>
-              <w:spacing w:line="240" w:lineRule="auto"/>
+              <w:spacing w:line="360" w:lineRule="auto"/>
             </w:pPr>
             <w:r>
               <w:t xml:space="preserve">NIP. </w:t>
@@ -687,6 +524,7 @@
         <w:jc w:val="both"/>
       </w:pPr>
       <w:r>
+        <w:lastRenderedPageBreak/>
         <w:t xml:space="preserve">Foto Dokumentasi : </w:t>
       </w:r>
     </w:p>
@@ -714,7 +552,7 @@
 </file>
 
 <file path=word/endnotes.xml><?xml version="1.0" encoding="utf-8"?>
-<w:endnotes xmlns:wpc="http://schemas.microsoft.com/office/word/2010/wordprocessingCanvas" xmlns:cx="http://schemas.microsoft.com/office/drawing/2014/chartex" xmlns:cx1="http://schemas.microsoft.com/office/drawing/2015/9/8/chartex" xmlns:cx2="http://schemas.microsoft.com/office/drawing/2015/10/21/chartex" xmlns:cx3="http://schemas.microsoft.com/office/drawing/2016/5/9/chartex" xmlns:cx4="http://schemas.microsoft.com/office/drawing/2016/5/10/chartex" xmlns:cx5="http://schemas.microsoft.com/office/drawing/2016/5/11/chartex" xmlns:cx6="http://schemas.microsoft.com/office/drawing/2016/5/12/chartex" xmlns:cx7="http://schemas.microsoft.com/office/drawing/2016/5/13/chartex" xmlns:cx8="http://schemas.microsoft.com/office/drawing/2016/5/14/chartex" xmlns:mc="http://schemas.openxmlformats.org/markup-compatibility/2006" xmlns:aink="http://schemas.microsoft.com/office/drawing/2016/ink" xmlns:am3d="http://schemas.microsoft.com/office/drawing/2017/model3d" xmlns:o="urn:schemas-microsoft-com:office:office" xmlns:oel="http://schemas.microsoft.com/office/2019/extlst" xmlns:r="http://schemas.openxmlformats.org/officeDocument/2006/relationships" xmlns:m="http://schemas.openxmlformats.org/officeDocument/2006/math" xmlns:v="urn:schemas-microsoft-com:vml" xmlns:wp14="http://schemas.microsoft.com/office/word/2010/wordprocessingDrawing" xmlns:wp="http://schemas.openxmlformats.org/drawingml/2006/wordprocessingDrawing" xmlns:w10="urn:schemas-microsoft-com:office:word" xmlns:w="http://schemas.openxmlformats.org/wordprocessingml/2006/main" xmlns:w14="http://schemas.microsoft.com/office/word/2010/wordml" xmlns:w15="http://schemas.microsoft.com/office/word/2012/wordml" xmlns:w16cei="http://schemas.microsoft.com/office/word/2026/wordml/cei" xmlns:w16cex="http://schemas.microsoft.com/office/word/2018/wordml/cex" xmlns:w16cid="http://schemas.microsoft.com/office/word/2016/wordml/cid" xmlns:w16="http://schemas.microsoft.com/office/word/2018/wordml" xmlns:w16du="http://schemas.microsoft.com/office/word/2023/wordml/word16du" xmlns:w16sdtdh="http://schemas.microsoft.com/office/word/2020/wordml/sdtdatahash" xmlns:w16sdtfl="http://schemas.microsoft.com/office/word/2024/wordml/sdtformatlock" xmlns:w16se="http://schemas.microsoft.com/office/word/2015/wordml/symex" xmlns:wpg="http://schemas.microsoft.com/office/word/2010/wordprocessingGroup" xmlns:wpi="http://schemas.microsoft.com/office/word/2010/wordprocessingInk" xmlns:wne="http://schemas.microsoft.com/office/word/2006/wordml" xmlns:wps="http://schemas.microsoft.com/office/word/2010/wordprocessingShape" mc:Ignorable="w14 w15 w16se w16cid w16 w16cex w16sdtdh w16sdtfl w16du wp14">
+<w:endnotes xmlns:wpc="http://schemas.microsoft.com/office/word/2010/wordprocessingCanvas" xmlns:cx="http://schemas.microsoft.com/office/drawing/2014/chartex" xmlns:cx1="http://schemas.microsoft.com/office/drawing/2015/9/8/chartex" xmlns:cx2="http://schemas.microsoft.com/office/drawing/2015/10/21/chartex" xmlns:cx3="http://schemas.microsoft.com/office/drawing/2016/5/9/chartex" xmlns:cx4="http://schemas.microsoft.com/office/drawing/2016/5/10/chartex" xmlns:cx5="http://schemas.microsoft.com/office/drawing/2016/5/11/chartex" xmlns:cx6="http://schemas.microsoft.com/office/drawing/2016/5/12/chartex" xmlns:cx7="http://schemas.microsoft.com/office/drawing/2016/5/13/chartex" xmlns:cx8="http://schemas.microsoft.com/office/drawing/2016/5/14/chartex" xmlns:mc="http://schemas.openxmlformats.org/markup-compatibility/2006" xmlns:aink="http://schemas.microsoft.com/office/drawing/2016/ink" xmlns:am3d="http://schemas.microsoft.com/office/drawing/2017/model3d" xmlns:o="urn:schemas-microsoft-com:office:office" xmlns:oel="http://schemas.microsoft.com/office/2019/extlst" xmlns:r="http://schemas.openxmlformats.org/officeDocument/2006/relationships" xmlns:m="http://schemas.openxmlformats.org/officeDocument/2006/math" xmlns:v="urn:schemas-microsoft-com:vml" xmlns:wp14="http://schemas.microsoft.com/office/word/2010/wordprocessingDrawing" xmlns:wp="http://schemas.openxmlformats.org/drawingml/2006/wordprocessingDrawing" xmlns:w10="urn:schemas-microsoft-com:office:word" xmlns:w="http://schemas.openxmlformats.org/wordprocessingml/2006/main" xmlns:w14="http://schemas.microsoft.com/office/word/2010/wordml" xmlns:w15="http://schemas.microsoft.com/office/word/2012/wordml" xmlns:w16cex="http://schemas.microsoft.com/office/word/2018/wordml/cex" xmlns:w16cid="http://schemas.microsoft.com/office/word/2016/wordml/cid" xmlns:w16="http://schemas.microsoft.com/office/word/2018/wordml" xmlns:w16du="http://schemas.microsoft.com/office/word/2023/wordml/word16du" xmlns:w16sdtdh="http://schemas.microsoft.com/office/word/2020/wordml/sdtdatahash" xmlns:w16sdtfl="http://schemas.microsoft.com/office/word/2024/wordml/sdtformatlock" xmlns:w16se="http://schemas.microsoft.com/office/word/2015/wordml/symex" xmlns:wpg="http://schemas.microsoft.com/office/word/2010/wordprocessingGroup" xmlns:wpi="http://schemas.microsoft.com/office/word/2010/wordprocessingInk" xmlns:wne="http://schemas.microsoft.com/office/word/2006/wordml" xmlns:wps="http://schemas.microsoft.com/office/word/2010/wordprocessingShape" mc:Ignorable="w14 w15 w16se w16cid w16 w16cex w16sdtdh w16sdtfl w16du wp14">
   <w:endnote w:type="separator" w:id="-1">
     <w:p>
       <w:pPr>
@@ -739,13 +577,13 @@
 </file>
 
 <file path=word/footer1.xml><?xml version="1.0" encoding="utf-8"?>
-<w:ftr xmlns:wpc="http://schemas.microsoft.com/office/word/2010/wordprocessingCanvas" xmlns:cx="http://schemas.microsoft.com/office/drawing/2014/chartex" xmlns:cx1="http://schemas.microsoft.com/office/drawing/2015/9/8/chartex" xmlns:cx2="http://schemas.microsoft.com/office/drawing/2015/10/21/chartex" xmlns:cx3="http://schemas.microsoft.com/office/drawing/2016/5/9/chartex" xmlns:cx4="http://schemas.microsoft.com/office/drawing/2016/5/10/chartex" xmlns:cx5="http://schemas.microsoft.com/office/drawing/2016/5/11/chartex" xmlns:cx6="http://schemas.microsoft.com/office/drawing/2016/5/12/chartex" xmlns:cx7="http://schemas.microsoft.com/office/drawing/2016/5/13/chartex" xmlns:cx8="http://schemas.microsoft.com/office/drawing/2016/5/14/chartex" xmlns:mc="http://schemas.openxmlformats.org/markup-compatibility/2006" xmlns:aink="http://schemas.microsoft.com/office/drawing/2016/ink" xmlns:am3d="http://schemas.microsoft.com/office/drawing/2017/model3d" xmlns:o="urn:schemas-microsoft-com:office:office" xmlns:oel="http://schemas.microsoft.com/office/2019/extlst" xmlns:r="http://schemas.openxmlformats.org/officeDocument/2006/relationships" xmlns:m="http://schemas.openxmlformats.org/officeDocument/2006/math" xmlns:v="urn:schemas-microsoft-com:vml" xmlns:wp14="http://schemas.microsoft.com/office/word/2010/wordprocessingDrawing" xmlns:wp="http://schemas.openxmlformats.org/drawingml/2006/wordprocessingDrawing" xmlns:w10="urn:schemas-microsoft-com:office:word" xmlns:w="http://schemas.openxmlformats.org/wordprocessingml/2006/main" xmlns:w14="http://schemas.microsoft.com/office/word/2010/wordml" xmlns:w15="http://schemas.microsoft.com/office/word/2012/wordml" xmlns:w16cei="http://schemas.microsoft.com/office/word/2026/wordml/cei" xmlns:w16cex="http://schemas.microsoft.com/office/word/2018/wordml/cex" xmlns:w16cid="http://schemas.microsoft.com/office/word/2016/wordml/cid" xmlns:w16="http://schemas.microsoft.com/office/word/2018/wordml" xmlns:w16du="http://schemas.microsoft.com/office/word/2023/wordml/word16du" xmlns:w16sdtdh="http://schemas.microsoft.com/office/word/2020/wordml/sdtdatahash" xmlns:w16sdtfl="http://schemas.microsoft.com/office/word/2024/wordml/sdtformatlock" xmlns:w16se="http://schemas.microsoft.com/office/word/2015/wordml/symex" xmlns:wpg="http://schemas.microsoft.com/office/word/2010/wordprocessingGroup" xmlns:wpi="http://schemas.microsoft.com/office/word/2010/wordprocessingInk" xmlns:wne="http://schemas.microsoft.com/office/word/2006/wordml" xmlns:wps="http://schemas.microsoft.com/office/word/2010/wordprocessingShape" mc:Ignorable="w14 w15 w16se w16cid w16 w16cex w16sdtdh w16sdtfl w16du wp14">
+<w:ftr xmlns:wpc="http://schemas.microsoft.com/office/word/2010/wordprocessingCanvas" xmlns:cx="http://schemas.microsoft.com/office/drawing/2014/chartex" xmlns:cx1="http://schemas.microsoft.com/office/drawing/2015/9/8/chartex" xmlns:cx2="http://schemas.microsoft.com/office/drawing/2015/10/21/chartex" xmlns:cx3="http://schemas.microsoft.com/office/drawing/2016/5/9/chartex" xmlns:cx4="http://schemas.microsoft.com/office/drawing/2016/5/10/chartex" xmlns:cx5="http://schemas.microsoft.com/office/drawing/2016/5/11/chartex" xmlns:cx6="http://schemas.microsoft.com/office/drawing/2016/5/12/chartex" xmlns:cx7="http://schemas.microsoft.com/office/drawing/2016/5/13/chartex" xmlns:cx8="http://schemas.microsoft.com/office/drawing/2016/5/14/chartex" xmlns:mc="http://schemas.openxmlformats.org/markup-compatibility/2006" xmlns:aink="http://schemas.microsoft.com/office/drawing/2016/ink" xmlns:am3d="http://schemas.microsoft.com/office/drawing/2017/model3d" xmlns:o="urn:schemas-microsoft-com:office:office" xmlns:oel="http://schemas.microsoft.com/office/2019/extlst" xmlns:r="http://schemas.openxmlformats.org/officeDocument/2006/relationships" xmlns:m="http://schemas.openxmlformats.org/officeDocument/2006/math" xmlns:v="urn:schemas-microsoft-com:vml" xmlns:wp14="http://schemas.microsoft.com/office/word/2010/wordprocessingDrawing" xmlns:wp="http://schemas.openxmlformats.org/drawingml/2006/wordprocessingDrawing" xmlns:w10="urn:schemas-microsoft-com:office:word" xmlns:w="http://schemas.openxmlformats.org/wordprocessingml/2006/main" xmlns:w14="http://schemas.microsoft.com/office/word/2010/wordml" xmlns:w15="http://schemas.microsoft.com/office/word/2012/wordml" xmlns:w16cex="http://schemas.microsoft.com/office/word/2018/wordml/cex" xmlns:w16cid="http://schemas.microsoft.com/office/word/2016/wordml/cid" xmlns:w16="http://schemas.microsoft.com/office/word/2018/wordml" xmlns:w16du="http://schemas.microsoft.com/office/word/2023/wordml/word16du" xmlns:w16sdtdh="http://schemas.microsoft.com/office/word/2020/wordml/sdtdatahash" xmlns:w16sdtfl="http://schemas.microsoft.com/office/word/2024/wordml/sdtformatlock" xmlns:w16se="http://schemas.microsoft.com/office/word/2015/wordml/symex" xmlns:wpg="http://schemas.microsoft.com/office/word/2010/wordprocessingGroup" xmlns:wpi="http://schemas.microsoft.com/office/word/2010/wordprocessingInk" xmlns:wne="http://schemas.microsoft.com/office/word/2006/wordml" xmlns:wps="http://schemas.microsoft.com/office/word/2010/wordprocessingShape" mc:Ignorable="w14 w15 w16se w16cid w16 w16cex w16sdtdh w16sdtfl w16du wp14">
   <w:p/>
 </w:ftr>
 </file>
 
 <file path=word/footnotes.xml><?xml version="1.0" encoding="utf-8"?>
-<w:footnotes xmlns:wpc="http://schemas.microsoft.com/office/word/2010/wordprocessingCanvas" xmlns:cx="http://schemas.microsoft.com/office/drawing/2014/chartex" xmlns:cx1="http://schemas.microsoft.com/office/drawing/2015/9/8/chartex" xmlns:cx2="http://schemas.microsoft.com/office/drawing/2015/10/21/chartex" xmlns:cx3="http://schemas.microsoft.com/office/drawing/2016/5/9/chartex" xmlns:cx4="http://schemas.microsoft.com/office/drawing/2016/5/10/chartex" xmlns:cx5="http://schemas.microsoft.com/office/drawing/2016/5/11/chartex" xmlns:cx6="http://schemas.microsoft.com/office/drawing/2016/5/12/chartex" xmlns:cx7="http://schemas.microsoft.com/office/drawing/2016/5/13/chartex" xmlns:cx8="http://schemas.microsoft.com/office/drawing/2016/5/14/chartex" xmlns:mc="http://schemas.openxmlformats.org/markup-compatibility/2006" xmlns:aink="http://schemas.microsoft.com/office/drawing/2016/ink" xmlns:am3d="http://schemas.microsoft.com/office/drawing/2017/model3d" xmlns:o="urn:schemas-microsoft-com:office:office" xmlns:oel="http://schemas.microsoft.com/office/2019/extlst" xmlns:r="http://schemas.openxmlformats.org/officeDocument/2006/relationships" xmlns:m="http://schemas.openxmlformats.org/officeDocument/2006/math" xmlns:v="urn:schemas-microsoft-com:vml" xmlns:wp14="http://schemas.microsoft.com/office/word/2010/wordprocessingDrawing" xmlns:wp="http://schemas.openxmlformats.org/drawingml/2006/wordprocessingDrawing" xmlns:w10="urn:schemas-microsoft-com:office:word" xmlns:w="http://schemas.openxmlformats.org/wordprocessingml/2006/main" xmlns:w14="http://schemas.microsoft.com/office/word/2010/wordml" xmlns:w15="http://schemas.microsoft.com/office/word/2012/wordml" xmlns:w16cei="http://schemas.microsoft.com/office/word/2026/wordml/cei" xmlns:w16cex="http://schemas.microsoft.com/office/word/2018/wordml/cex" xmlns:w16cid="http://schemas.microsoft.com/office/word/2016/wordml/cid" xmlns:w16="http://schemas.microsoft.com/office/word/2018/wordml" xmlns:w16du="http://schemas.microsoft.com/office/word/2023/wordml/word16du" xmlns:w16sdtdh="http://schemas.microsoft.com/office/word/2020/wordml/sdtdatahash" xmlns:w16sdtfl="http://schemas.microsoft.com/office/word/2024/wordml/sdtformatlock" xmlns:w16se="http://schemas.microsoft.com/office/word/2015/wordml/symex" xmlns:wpg="http://schemas.microsoft.com/office/word/2010/wordprocessingGroup" xmlns:wpi="http://schemas.microsoft.com/office/word/2010/wordprocessingInk" xmlns:wne="http://schemas.microsoft.com/office/word/2006/wordml" xmlns:wps="http://schemas.microsoft.com/office/word/2010/wordprocessingShape" mc:Ignorable="w14 w15 w16se w16cid w16 w16cex w16sdtdh w16sdtfl w16du wp14">
+<w:footnotes xmlns:wpc="http://schemas.microsoft.com/office/word/2010/wordprocessingCanvas" xmlns:cx="http://schemas.microsoft.com/office/drawing/2014/chartex" xmlns:cx1="http://schemas.microsoft.com/office/drawing/2015/9/8/chartex" xmlns:cx2="http://schemas.microsoft.com/office/drawing/2015/10/21/chartex" xmlns:cx3="http://schemas.microsoft.com/office/drawing/2016/5/9/chartex" xmlns:cx4="http://schemas.microsoft.com/office/drawing/2016/5/10/chartex" xmlns:cx5="http://schemas.microsoft.com/office/drawing/2016/5/11/chartex" xmlns:cx6="http://schemas.microsoft.com/office/drawing/2016/5/12/chartex" xmlns:cx7="http://schemas.microsoft.com/office/drawing/2016/5/13/chartex" xmlns:cx8="http://schemas.microsoft.com/office/drawing/2016/5/14/chartex" xmlns:mc="http://schemas.openxmlformats.org/markup-compatibility/2006" xmlns:aink="http://schemas.microsoft.com/office/drawing/2016/ink" xmlns:am3d="http://schemas.microsoft.com/office/drawing/2017/model3d" xmlns:o="urn:schemas-microsoft-com:office:office" xmlns:oel="http://schemas.microsoft.com/office/2019/extlst" xmlns:r="http://schemas.openxmlformats.org/officeDocument/2006/relationships" xmlns:m="http://schemas.openxmlformats.org/officeDocument/2006/math" xmlns:v="urn:schemas-microsoft-com:vml" xmlns:wp14="http://schemas.microsoft.com/office/word/2010/wordprocessingDrawing" xmlns:wp="http://schemas.openxmlformats.org/drawingml/2006/wordprocessingDrawing" xmlns:w10="urn:schemas-microsoft-com:office:word" xmlns:w="http://schemas.openxmlformats.org/wordprocessingml/2006/main" xmlns:w14="http://schemas.microsoft.com/office/word/2010/wordml" xmlns:w15="http://schemas.microsoft.com/office/word/2012/wordml" xmlns:w16cex="http://schemas.microsoft.com/office/word/2018/wordml/cex" xmlns:w16cid="http://schemas.microsoft.com/office/word/2016/wordml/cid" xmlns:w16="http://schemas.microsoft.com/office/word/2018/wordml" xmlns:w16du="http://schemas.microsoft.com/office/word/2023/wordml/word16du" xmlns:w16sdtdh="http://schemas.microsoft.com/office/word/2020/wordml/sdtdatahash" xmlns:w16sdtfl="http://schemas.microsoft.com/office/word/2024/wordml/sdtformatlock" xmlns:w16se="http://schemas.microsoft.com/office/word/2015/wordml/symex" xmlns:wpg="http://schemas.microsoft.com/office/word/2010/wordprocessingGroup" xmlns:wpi="http://schemas.microsoft.com/office/word/2010/wordprocessingInk" xmlns:wne="http://schemas.microsoft.com/office/word/2006/wordml" xmlns:wps="http://schemas.microsoft.com/office/word/2010/wordprocessingShape" mc:Ignorable="w14 w15 w16se w16cid w16 w16cex w16sdtdh w16sdtfl w16du wp14">
   <w:footnote w:type="separator" w:id="-1">
     <w:p>
       <w:pPr>
@@ -770,13 +608,13 @@
 </file>
 
 <file path=word/header1.xml><?xml version="1.0" encoding="utf-8"?>
-<w:hdr xmlns:wpc="http://schemas.microsoft.com/office/word/2010/wordprocessingCanvas" xmlns:cx="http://schemas.microsoft.com/office/drawing/2014/chartex" xmlns:cx1="http://schemas.microsoft.com/office/drawing/2015/9/8/chartex" xmlns:cx2="http://schemas.microsoft.com/office/drawing/2015/10/21/chartex" xmlns:cx3="http://schemas.microsoft.com/office/drawing/2016/5/9/chartex" xmlns:cx4="http://schemas.microsoft.com/office/drawing/2016/5/10/chartex" xmlns:cx5="http://schemas.microsoft.com/office/drawing/2016/5/11/chartex" xmlns:cx6="http://schemas.microsoft.com/office/drawing/2016/5/12/chartex" xmlns:cx7="http://schemas.microsoft.com/office/drawing/2016/5/13/chartex" xmlns:cx8="http://schemas.microsoft.com/office/drawing/2016/5/14/chartex" xmlns:mc="http://schemas.openxmlformats.org/markup-compatibility/2006" xmlns:aink="http://schemas.microsoft.com/office/drawing/2016/ink" xmlns:am3d="http://schemas.microsoft.com/office/drawing/2017/model3d" xmlns:o="urn:schemas-microsoft-com:office:office" xmlns:oel="http://schemas.microsoft.com/office/2019/extlst" xmlns:r="http://schemas.openxmlformats.org/officeDocument/2006/relationships" xmlns:m="http://schemas.openxmlformats.org/officeDocument/2006/math" xmlns:v="urn:schemas-microsoft-com:vml" xmlns:wp14="http://schemas.microsoft.com/office/word/2010/wordprocessingDrawing" xmlns:wp="http://schemas.openxmlformats.org/drawingml/2006/wordprocessingDrawing" xmlns:w10="urn:schemas-microsoft-com:office:word" xmlns:w="http://schemas.openxmlformats.org/wordprocessingml/2006/main" xmlns:w14="http://schemas.microsoft.com/office/word/2010/wordml" xmlns:w15="http://schemas.microsoft.com/office/word/2012/wordml" xmlns:w16cei="http://schemas.microsoft.com/office/word/2026/wordml/cei" xmlns:w16cex="http://schemas.microsoft.com/office/word/2018/wordml/cex" xmlns:w16cid="http://schemas.microsoft.com/office/word/2016/wordml/cid" xmlns:w16="http://schemas.microsoft.com/office/word/2018/wordml" xmlns:w16du="http://schemas.microsoft.com/office/word/2023/wordml/word16du" xmlns:w16sdtdh="http://schemas.microsoft.com/office/word/2020/wordml/sdtdatahash" xmlns:w16sdtfl="http://schemas.microsoft.com/office/word/2024/wordml/sdtformatlock" xmlns:w16se="http://schemas.microsoft.com/office/word/2015/wordml/symex" xmlns:wpg="http://schemas.microsoft.com/office/word/2010/wordprocessingGroup" xmlns:wpi="http://schemas.microsoft.com/office/word/2010/wordprocessingInk" xmlns:wne="http://schemas.microsoft.com/office/word/2006/wordml" xmlns:wps="http://schemas.microsoft.com/office/word/2010/wordprocessingShape" mc:Ignorable="w14 w15 w16se w16cid w16 w16cex w16sdtdh w16sdtfl w16du wp14">
+<w:hdr xmlns:wpc="http://schemas.microsoft.com/office/word/2010/wordprocessingCanvas" xmlns:cx="http://schemas.microsoft.com/office/drawing/2014/chartex" xmlns:cx1="http://schemas.microsoft.com/office/drawing/2015/9/8/chartex" xmlns:cx2="http://schemas.microsoft.com/office/drawing/2015/10/21/chartex" xmlns:cx3="http://schemas.microsoft.com/office/drawing/2016/5/9/chartex" xmlns:cx4="http://schemas.microsoft.com/office/drawing/2016/5/10/chartex" xmlns:cx5="http://schemas.microsoft.com/office/drawing/2016/5/11/chartex" xmlns:cx6="http://schemas.microsoft.com/office/drawing/2016/5/12/chartex" xmlns:cx7="http://schemas.microsoft.com/office/drawing/2016/5/13/chartex" xmlns:cx8="http://schemas.microsoft.com/office/drawing/2016/5/14/chartex" xmlns:mc="http://schemas.openxmlformats.org/markup-compatibility/2006" xmlns:aink="http://schemas.microsoft.com/office/drawing/2016/ink" xmlns:am3d="http://schemas.microsoft.com/office/drawing/2017/model3d" xmlns:o="urn:schemas-microsoft-com:office:office" xmlns:oel="http://schemas.microsoft.com/office/2019/extlst" xmlns:r="http://schemas.openxmlformats.org/officeDocument/2006/relationships" xmlns:m="http://schemas.openxmlformats.org/officeDocument/2006/math" xmlns:v="urn:schemas-microsoft-com:vml" xmlns:wp14="http://schemas.microsoft.com/office/word/2010/wordprocessingDrawing" xmlns:wp="http://schemas.openxmlformats.org/drawingml/2006/wordprocessingDrawing" xmlns:w10="urn:schemas-microsoft-com:office:word" xmlns:w="http://schemas.openxmlformats.org/wordprocessingml/2006/main" xmlns:w14="http://schemas.microsoft.com/office/word/2010/wordml" xmlns:w15="http://schemas.microsoft.com/office/word/2012/wordml" xmlns:w16cex="http://schemas.microsoft.com/office/word/2018/wordml/cex" xmlns:w16cid="http://schemas.microsoft.com/office/word/2016/wordml/cid" xmlns:w16="http://schemas.microsoft.com/office/word/2018/wordml" xmlns:w16du="http://schemas.microsoft.com/office/word/2023/wordml/word16du" xmlns:w16sdtdh="http://schemas.microsoft.com/office/word/2020/wordml/sdtdatahash" xmlns:w16sdtfl="http://schemas.microsoft.com/office/word/2024/wordml/sdtformatlock" xmlns:w16se="http://schemas.microsoft.com/office/word/2015/wordml/symex" xmlns:wpg="http://schemas.microsoft.com/office/word/2010/wordprocessingGroup" xmlns:wpi="http://schemas.microsoft.com/office/word/2010/wordprocessingInk" xmlns:wne="http://schemas.microsoft.com/office/word/2006/wordml" xmlns:wps="http://schemas.microsoft.com/office/word/2010/wordprocessingShape" mc:Ignorable="w14 w15 w16se w16cid w16 w16cex w16sdtdh w16sdtfl w16du wp14">
   <w:p/>
 </w:hdr>
 </file>
 
 <file path=word/header2.xml><?xml version="1.0" encoding="utf-8"?>
-<w:hdr xmlns:wpc="http://schemas.microsoft.com/office/word/2010/wordprocessingCanvas" xmlns:cx="http://schemas.microsoft.com/office/drawing/2014/chartex" xmlns:cx1="http://schemas.microsoft.com/office/drawing/2015/9/8/chartex" xmlns:cx2="http://schemas.microsoft.com/office/drawing/2015/10/21/chartex" xmlns:cx3="http://schemas.microsoft.com/office/drawing/2016/5/9/chartex" xmlns:cx4="http://schemas.microsoft.com/office/drawing/2016/5/10/chartex" xmlns:cx5="http://schemas.microsoft.com/office/drawing/2016/5/11/chartex" xmlns:cx6="http://schemas.microsoft.com/office/drawing/2016/5/12/chartex" xmlns:cx7="http://schemas.microsoft.com/office/drawing/2016/5/13/chartex" xmlns:cx8="http://schemas.microsoft.com/office/drawing/2016/5/14/chartex" xmlns:mc="http://schemas.openxmlformats.org/markup-compatibility/2006" xmlns:aink="http://schemas.microsoft.com/office/drawing/2016/ink" xmlns:am3d="http://schemas.microsoft.com/office/drawing/2017/model3d" xmlns:o="urn:schemas-microsoft-com:office:office" xmlns:oel="http://schemas.microsoft.com/office/2019/extlst" xmlns:r="http://schemas.openxmlformats.org/officeDocument/2006/relationships" xmlns:m="http://schemas.openxmlformats.org/officeDocument/2006/math" xmlns:v="urn:schemas-microsoft-com:vml" xmlns:wp14="http://schemas.microsoft.com/office/word/2010/wordprocessingDrawing" xmlns:wp="http://schemas.openxmlformats.org/drawingml/2006/wordprocessingDrawing" xmlns:w10="urn:schemas-microsoft-com:office:word" xmlns:w="http://schemas.openxmlformats.org/wordprocessingml/2006/main" xmlns:w14="http://schemas.microsoft.com/office/word/2010/wordml" xmlns:w15="http://schemas.microsoft.com/office/word/2012/wordml" xmlns:w16cei="http://schemas.microsoft.com/office/word/2026/wordml/cei" xmlns:w16cex="http://schemas.microsoft.com/office/word/2018/wordml/cex" xmlns:w16cid="http://schemas.microsoft.com/office/word/2016/wordml/cid" xmlns:w16="http://schemas.microsoft.com/office/word/2018/wordml" xmlns:w16du="http://schemas.microsoft.com/office/word/2023/wordml/word16du" xmlns:w16sdtdh="http://schemas.microsoft.com/office/word/2020/wordml/sdtdatahash" xmlns:w16sdtfl="http://schemas.microsoft.com/office/word/2024/wordml/sdtformatlock" xmlns:w16se="http://schemas.microsoft.com/office/word/2015/wordml/symex" xmlns:wpg="http://schemas.microsoft.com/office/word/2010/wordprocessingGroup" xmlns:wpi="http://schemas.microsoft.com/office/word/2010/wordprocessingInk" xmlns:wne="http://schemas.microsoft.com/office/word/2006/wordml" xmlns:wps="http://schemas.microsoft.com/office/word/2010/wordprocessingShape" mc:Ignorable="w14 w15 w16se w16cid w16 w16cex w16sdtdh w16sdtfl w16du wp14">
+<w:hdr xmlns:wpc="http://schemas.microsoft.com/office/word/2010/wordprocessingCanvas" xmlns:cx="http://schemas.microsoft.com/office/drawing/2014/chartex" xmlns:cx1="http://schemas.microsoft.com/office/drawing/2015/9/8/chartex" xmlns:cx2="http://schemas.microsoft.com/office/drawing/2015/10/21/chartex" xmlns:cx3="http://schemas.microsoft.com/office/drawing/2016/5/9/chartex" xmlns:cx4="http://schemas.microsoft.com/office/drawing/2016/5/10/chartex" xmlns:cx5="http://schemas.microsoft.com/office/drawing/2016/5/11/chartex" xmlns:cx6="http://schemas.microsoft.com/office/drawing/2016/5/12/chartex" xmlns:cx7="http://schemas.microsoft.com/office/drawing/2016/5/13/chartex" xmlns:cx8="http://schemas.microsoft.com/office/drawing/2016/5/14/chartex" xmlns:mc="http://schemas.openxmlformats.org/markup-compatibility/2006" xmlns:aink="http://schemas.microsoft.com/office/drawing/2016/ink" xmlns:am3d="http://schemas.microsoft.com/office/drawing/2017/model3d" xmlns:o="urn:schemas-microsoft-com:office:office" xmlns:oel="http://schemas.microsoft.com/office/2019/extlst" xmlns:r="http://schemas.openxmlformats.org/officeDocument/2006/relationships" xmlns:m="http://schemas.openxmlformats.org/officeDocument/2006/math" xmlns:v="urn:schemas-microsoft-com:vml" xmlns:wp14="http://schemas.microsoft.com/office/word/2010/wordprocessingDrawing" xmlns:wp="http://schemas.openxmlformats.org/drawingml/2006/wordprocessingDrawing" xmlns:w10="urn:schemas-microsoft-com:office:word" xmlns:w="http://schemas.openxmlformats.org/wordprocessingml/2006/main" xmlns:w14="http://schemas.microsoft.com/office/word/2010/wordml" xmlns:w15="http://schemas.microsoft.com/office/word/2012/wordml" xmlns:w16cex="http://schemas.microsoft.com/office/word/2018/wordml/cex" xmlns:w16cid="http://schemas.microsoft.com/office/word/2016/wordml/cid" xmlns:w16="http://schemas.microsoft.com/office/word/2018/wordml" xmlns:w16du="http://schemas.microsoft.com/office/word/2023/wordml/word16du" xmlns:w16sdtdh="http://schemas.microsoft.com/office/word/2020/wordml/sdtdatahash" xmlns:w16sdtfl="http://schemas.microsoft.com/office/word/2024/wordml/sdtformatlock" xmlns:w16se="http://schemas.microsoft.com/office/word/2015/wordml/symex" xmlns:wpg="http://schemas.microsoft.com/office/word/2010/wordprocessingGroup" xmlns:wpi="http://schemas.microsoft.com/office/word/2010/wordprocessingInk" xmlns:wne="http://schemas.microsoft.com/office/word/2006/wordml" xmlns:wps="http://schemas.microsoft.com/office/word/2010/wordprocessingShape" mc:Ignorable="w14 w15 w16se w16cid w16 w16cex w16sdtdh w16sdtfl w16du wp14">
   <w:p>
     <w:r>
       <w:rPr>
@@ -823,7 +661,7 @@
 </file>
 
 <file path=word/numbering.xml><?xml version="1.0" encoding="utf-8"?>
-<w:numbering xmlns:wpc="http://schemas.microsoft.com/office/word/2010/wordprocessingCanvas" xmlns:cx="http://schemas.microsoft.com/office/drawing/2014/chartex" xmlns:cx1="http://schemas.microsoft.com/office/drawing/2015/9/8/chartex" xmlns:cx2="http://schemas.microsoft.com/office/drawing/2015/10/21/chartex" xmlns:cx3="http://schemas.microsoft.com/office/drawing/2016/5/9/chartex" xmlns:cx4="http://schemas.microsoft.com/office/drawing/2016/5/10/chartex" xmlns:cx5="http://schemas.microsoft.com/office/drawing/2016/5/11/chartex" xmlns:cx6="http://schemas.microsoft.com/office/drawing/2016/5/12/chartex" xmlns:cx7="http://schemas.microsoft.com/office/drawing/2016/5/13/chartex" xmlns:cx8="http://schemas.microsoft.com/office/drawing/2016/5/14/chartex" xmlns:mc="http://schemas.openxmlformats.org/markup-compatibility/2006" xmlns:aink="http://schemas.microsoft.com/office/drawing/2016/ink" xmlns:am3d="http://schemas.microsoft.com/office/drawing/2017/model3d" xmlns:o="urn:schemas-microsoft-com:office:office" xmlns:oel="http://schemas.microsoft.com/office/2019/extlst" xmlns:r="http://schemas.openxmlformats.org/officeDocument/2006/relationships" xmlns:m="http://schemas.openxmlformats.org/officeDocument/2006/math" xmlns:v="urn:schemas-microsoft-com:vml" xmlns:wp14="http://schemas.microsoft.com/office/word/2010/wordprocessingDrawing" xmlns:wp="http://schemas.openxmlformats.org/drawingml/2006/wordprocessingDrawing" xmlns:w10="urn:schemas-microsoft-com:office:word" xmlns:w="http://schemas.openxmlformats.org/wordprocessingml/2006/main" xmlns:w14="http://schemas.microsoft.com/office/word/2010/wordml" xmlns:w15="http://schemas.microsoft.com/office/word/2012/wordml" xmlns:w16cei="http://schemas.microsoft.com/office/word/2026/wordml/cei" xmlns:w16cex="http://schemas.microsoft.com/office/word/2018/wordml/cex" xmlns:w16cid="http://schemas.microsoft.com/office/word/2016/wordml/cid" xmlns:w16="http://schemas.microsoft.com/office/word/2018/wordml" xmlns:w16du="http://schemas.microsoft.com/office/word/2023/wordml/word16du" xmlns:w16sdtdh="http://schemas.microsoft.com/office/word/2020/wordml/sdtdatahash" xmlns:w16sdtfl="http://schemas.microsoft.com/office/word/2024/wordml/sdtformatlock" xmlns:w16se="http://schemas.microsoft.com/office/word/2015/wordml/symex" xmlns:wpg="http://schemas.microsoft.com/office/word/2010/wordprocessingGroup" xmlns:wpi="http://schemas.microsoft.com/office/word/2010/wordprocessingInk" xmlns:wne="http://schemas.microsoft.com/office/word/2006/wordml" xmlns:wps="http://schemas.microsoft.com/office/word/2010/wordprocessingShape" mc:Ignorable="w14 w15 w16se w16cid w16 w16cex w16sdtdh w16sdtfl w16du wp14">
+<w:numbering xmlns:wpc="http://schemas.microsoft.com/office/word/2010/wordprocessingCanvas" xmlns:cx="http://schemas.microsoft.com/office/drawing/2014/chartex" xmlns:cx1="http://schemas.microsoft.com/office/drawing/2015/9/8/chartex" xmlns:cx2="http://schemas.microsoft.com/office/drawing/2015/10/21/chartex" xmlns:cx3="http://schemas.microsoft.com/office/drawing/2016/5/9/chartex" xmlns:cx4="http://schemas.microsoft.com/office/drawing/2016/5/10/chartex" xmlns:cx5="http://schemas.microsoft.com/office/drawing/2016/5/11/chartex" xmlns:cx6="http://schemas.microsoft.com/office/drawing/2016/5/12/chartex" xmlns:cx7="http://schemas.microsoft.com/office/drawing/2016/5/13/chartex" xmlns:cx8="http://schemas.microsoft.com/office/drawing/2016/5/14/chartex" xmlns:mc="http://schemas.openxmlformats.org/markup-compatibility/2006" xmlns:aink="http://schemas.microsoft.com/office/drawing/2016/ink" xmlns:am3d="http://schemas.microsoft.com/office/drawing/2017/model3d" xmlns:o="urn:schemas-microsoft-com:office:office" xmlns:oel="http://schemas.microsoft.com/office/2019/extlst" xmlns:r="http://schemas.openxmlformats.org/officeDocument/2006/relationships" xmlns:m="http://schemas.openxmlformats.org/officeDocument/2006/math" xmlns:v="urn:schemas-microsoft-com:vml" xmlns:wp14="http://schemas.microsoft.com/office/word/2010/wordprocessingDrawing" xmlns:wp="http://schemas.openxmlformats.org/drawingml/2006/wordprocessingDrawing" xmlns:w10="urn:schemas-microsoft-com:office:word" xmlns:w="http://schemas.openxmlformats.org/wordprocessingml/2006/main" xmlns:w14="http://schemas.microsoft.com/office/word/2010/wordml" xmlns:w15="http://schemas.microsoft.com/office/word/2012/wordml" xmlns:w16cex="http://schemas.microsoft.com/office/word/2018/wordml/cex" xmlns:w16cid="http://schemas.microsoft.com/office/word/2016/wordml/cid" xmlns:w16="http://schemas.microsoft.com/office/word/2018/wordml" xmlns:w16du="http://schemas.microsoft.com/office/word/2023/wordml/word16du" xmlns:w16sdtdh="http://schemas.microsoft.com/office/word/2020/wordml/sdtdatahash" xmlns:w16sdtfl="http://schemas.microsoft.com/office/word/2024/wordml/sdtformatlock" xmlns:w16se="http://schemas.microsoft.com/office/word/2015/wordml/symex" xmlns:wpg="http://schemas.microsoft.com/office/word/2010/wordprocessingGroup" xmlns:wpi="http://schemas.microsoft.com/office/word/2010/wordprocessingInk" xmlns:wne="http://schemas.microsoft.com/office/word/2006/wordml" xmlns:wps="http://schemas.microsoft.com/office/word/2010/wordprocessingShape" mc:Ignorable="w14 w15 w16se w16cid w16 w16cex w16sdtdh w16sdtfl w16du wp14">
   <w:abstractNum w:abstractNumId="0" w15:restartNumberingAfterBreak="0">
     <w:nsid w:val="2BDA1763"/>
     <w:multiLevelType w:val="multilevel"/>

</xml_diff>